<commit_message>
nota en el script 0 y pequeña actualización en el form de caracterización
</commit_message>
<xml_diff>
--- a/docs/5-1. FORMULARIO_CARACTERIZACIÓN_FORMULACIÓN_PROBLEMAS-2.docx
+++ b/docs/5-1. FORMULARIO_CARACTERIZACIÓN_FORMULACIÓN_PROBLEMAS-2.docx
@@ -136,19 +136,11 @@
           <w:text/>
         </w:sdtPr>
         <w:sdtContent>
-          <w:proofErr w:type="spellStart"/>
           <w:r>
             <w:rPr>
               <w:rFonts w:ascii="Liberation Sans" w:eastAsia="Liberation Sans" w:hAnsi="Liberation Sans" w:cs="Liberation Sans"/>
             </w:rPr>
-            <w:t>Siseven</w:t>
-          </w:r>
-          <w:proofErr w:type="spellEnd"/>
-          <w:r>
-            <w:rPr>
-              <w:rFonts w:ascii="Liberation Sans" w:eastAsia="Liberation Sans" w:hAnsi="Liberation Sans" w:cs="Liberation Sans"/>
-            </w:rPr>
-            <w:t xml:space="preserve"> Larpsito Sahur Devs</w:t>
+            <w:t>Siseven Larpsito Sahur Devs</w:t>
           </w:r>
         </w:sdtContent>
       </w:sdt>
@@ -219,7 +211,7 @@
               <w:bCs/>
             </w:rPr>
             <w:br/>
-            <w:t>Juan David Amaya Patiño</w:t>
+            <w:t>Juan David Amaya Patiño: Universidad Distrital Francisco José de Caldas</w:t>
           </w:r>
           <w:r>
             <w:rPr>
@@ -227,24 +219,8 @@
               <w:b/>
               <w:bCs/>
             </w:rPr>
-            <w:t>: Universidad Distrital Francisco José de Caldas</w:t>
-          </w:r>
-          <w:r>
-            <w:rPr>
-              <w:rFonts w:ascii="Liberation Sans" w:eastAsia="Liberation Sans" w:hAnsi="Liberation Sans" w:cs="Liberation Sans"/>
-              <w:b/>
-              <w:bCs/>
-            </w:rPr>
             <w:br/>
-            <w:t>Tomás Alejandro Delgado Ortiz</w:t>
-          </w:r>
-          <w:r>
-            <w:rPr>
-              <w:rFonts w:ascii="Liberation Sans" w:eastAsia="Liberation Sans" w:hAnsi="Liberation Sans" w:cs="Liberation Sans"/>
-              <w:b/>
-              <w:bCs/>
-            </w:rPr>
-            <w:t>: Universidad Distrital Francisco José de Caldas</w:t>
+            <w:t>Tomás Alejandro Delgado Ortiz: Universidad Distrital Francisco José de Caldas</w:t>
           </w:r>
         </w:p>
       </w:sdtContent>
@@ -318,7 +294,7 @@
               <w:b/>
               <w:bCs/>
             </w:rPr>
-            <w:t>Ana Laura Morcote Chacón</w:t>
+            <w:t>Ana Laura Morcote Chacón, Analista de datos, estudiante</w:t>
           </w:r>
           <w:r>
             <w:rPr>
@@ -326,7 +302,8 @@
               <w:b/>
               <w:bCs/>
             </w:rPr>
-            <w:t>,</w:t>
+            <w:br/>
+            <w:t>Juan David Amaya Patiño, Analista de datos, estudiante</w:t>
           </w:r>
           <w:r>
             <w:rPr>
@@ -334,49 +311,8 @@
               <w:b/>
               <w:bCs/>
             </w:rPr>
-            <w:t xml:space="preserve"> </w:t>
-          </w:r>
-          <w:r>
-            <w:rPr>
-              <w:rFonts w:ascii="Liberation Sans" w:eastAsia="Liberation Sans" w:hAnsi="Liberation Sans" w:cs="Liberation Sans"/>
-              <w:b/>
-              <w:bCs/>
-            </w:rPr>
-            <w:t>Analista de datos, estudiante</w:t>
-          </w:r>
-          <w:r>
-            <w:rPr>
-              <w:rFonts w:ascii="Liberation Sans" w:eastAsia="Liberation Sans" w:hAnsi="Liberation Sans" w:cs="Liberation Sans"/>
-              <w:b/>
-              <w:bCs/>
-            </w:rPr>
             <w:br/>
-            <w:t>Juan David Amaya Patiño</w:t>
-          </w:r>
-          <w:r>
-            <w:rPr>
-              <w:rFonts w:ascii="Liberation Sans" w:eastAsia="Liberation Sans" w:hAnsi="Liberation Sans" w:cs="Liberation Sans"/>
-              <w:b/>
-              <w:bCs/>
-            </w:rPr>
-            <w:t>, Analista de datos, estudiante</w:t>
-          </w:r>
-          <w:r>
-            <w:rPr>
-              <w:rFonts w:ascii="Liberation Sans" w:eastAsia="Liberation Sans" w:hAnsi="Liberation Sans" w:cs="Liberation Sans"/>
-              <w:b/>
-              <w:bCs/>
-            </w:rPr>
-            <w:br/>
-            <w:t>Tomás Alejandro Delgado Ortiz</w:t>
-          </w:r>
-          <w:r>
-            <w:rPr>
-              <w:rFonts w:ascii="Liberation Sans" w:eastAsia="Liberation Sans" w:hAnsi="Liberation Sans" w:cs="Liberation Sans"/>
-              <w:b/>
-              <w:bCs/>
-            </w:rPr>
-            <w:t>, Analista de datos, estudiante</w:t>
+            <w:t>Tomás Alejandro Delgado Ortiz, Analista de datos, estudiante</w:t>
           </w:r>
         </w:p>
       </w:sdtContent>
@@ -994,23 +930,7 @@
                   <w:b/>
                   <w:bCs/>
                 </w:rPr>
-                <w:t xml:space="preserve">Fuente </w:t>
-              </w:r>
-              <w:r>
-                <w:rPr>
-                  <w:rFonts w:ascii="Liberation Sans" w:eastAsia="Liberation Sans" w:hAnsi="Liberation Sans" w:cs="Liberation Sans"/>
-                  <w:b/>
-                  <w:bCs/>
-                </w:rPr>
-                <w:t>2</w:t>
-              </w:r>
-              <w:r>
-                <w:rPr>
-                  <w:rFonts w:ascii="Liberation Sans" w:eastAsia="Liberation Sans" w:hAnsi="Liberation Sans" w:cs="Liberation Sans"/>
-                  <w:b/>
-                  <w:bCs/>
-                </w:rPr>
-                <w:t xml:space="preserve">: </w:t>
+                <w:t xml:space="preserve">Fuente 2: </w:t>
               </w:r>
               <w:r>
                 <w:rPr>
@@ -1219,15 +1139,7 @@
                       <w:b/>
                       <w:bCs/>
                     </w:rPr>
-                    <w:t xml:space="preserve"> </w:t>
-                  </w:r>
-                  <w:r>
-                    <w:rPr>
-                      <w:rFonts w:ascii="Liberation Sans" w:eastAsia="Liberation Sans" w:hAnsi="Liberation Sans" w:cs="Liberation Sans"/>
-                      <w:b/>
-                      <w:bCs/>
-                    </w:rPr>
-                    <w:t>(datos tomados desde el 06/25 hasta el 03/26)</w:t>
+                    <w:t xml:space="preserve"> (datos tomados desde el 06/25 hasta el 03/26)</w:t>
                   </w:r>
                   <w:r>
                     <w:rPr>
@@ -1245,13 +1157,6 @@
                       <w:bCs/>
                     </w:rPr>
                     <w:br/>
-                  </w:r>
-                  <w:r>
-                    <w:rPr>
-                      <w:rFonts w:ascii="Liberation Sans" w:eastAsia="Liberation Sans" w:hAnsi="Liberation Sans" w:cs="Liberation Sans"/>
-                      <w:b/>
-                      <w:bCs/>
-                    </w:rPr>
                     <w:t xml:space="preserve">-Nombre: </w:t>
                   </w:r>
                   <w:r>
@@ -1338,13 +1243,6 @@
                       <w:bCs/>
                     </w:rPr>
                     <w:br/>
-                  </w:r>
-                  <w:r>
-                    <w:rPr>
-                      <w:rFonts w:ascii="Liberation Sans" w:eastAsia="Liberation Sans" w:hAnsi="Liberation Sans" w:cs="Liberation Sans"/>
-                      <w:b/>
-                      <w:bCs/>
-                    </w:rPr>
                     <w:t xml:space="preserve">-Nombre: </w:t>
                   </w:r>
                   <w:r>
@@ -1422,30 +1320,7 @@
                       <w:bCs/>
                     </w:rPr>
                     <w:br/>
-                  </w:r>
-                  <w:r>
-                    <w:rPr>
-                      <w:rFonts w:ascii="Liberation Sans" w:eastAsia="Liberation Sans" w:hAnsi="Liberation Sans" w:cs="Liberation Sans"/>
-                      <w:b/>
-                      <w:bCs/>
-                    </w:rPr>
-                    <w:t xml:space="preserve">Fuente </w:t>
-                  </w:r>
-                  <w:r>
-                    <w:rPr>
-                      <w:rFonts w:ascii="Liberation Sans" w:eastAsia="Liberation Sans" w:hAnsi="Liberation Sans" w:cs="Liberation Sans"/>
-                      <w:b/>
-                      <w:bCs/>
-                    </w:rPr>
-                    <w:t>6</w:t>
-                  </w:r>
-                  <w:r>
-                    <w:rPr>
-                      <w:rFonts w:ascii="Liberation Sans" w:eastAsia="Liberation Sans" w:hAnsi="Liberation Sans" w:cs="Liberation Sans"/>
-                      <w:b/>
-                      <w:bCs/>
-                    </w:rPr>
-                    <w:t xml:space="preserve">: </w:t>
+                    <w:t xml:space="preserve">Fuente 6: </w:t>
                   </w:r>
                   <w:r>
                     <w:rPr>
@@ -1535,23 +1410,7 @@
                       <w:b/>
                       <w:bCs/>
                     </w:rPr>
-                    <w:t xml:space="preserve"> (</w:t>
-                  </w:r>
-                  <w:r>
-                    <w:rPr>
-                      <w:rFonts w:ascii="Liberation Sans" w:eastAsia="Liberation Sans" w:hAnsi="Liberation Sans" w:cs="Liberation Sans"/>
-                      <w:b/>
-                      <w:bCs/>
-                    </w:rPr>
-                    <w:t>datos tomados desde el 06/25 hasta el 03/26</w:t>
-                  </w:r>
-                  <w:r>
-                    <w:rPr>
-                      <w:rFonts w:ascii="Liberation Sans" w:eastAsia="Liberation Sans" w:hAnsi="Liberation Sans" w:cs="Liberation Sans"/>
-                      <w:b/>
-                      <w:bCs/>
-                    </w:rPr>
-                    <w:t>)</w:t>
+                    <w:t xml:space="preserve"> (datos tomados desde el 06/25 hasta el 03/26)</w:t>
                   </w:r>
                   <w:r>
                     <w:rPr>
@@ -1560,30 +1419,7 @@
                       <w:bCs/>
                     </w:rPr>
                     <w:br/>
-                  </w:r>
-                  <w:r>
-                    <w:rPr>
-                      <w:rFonts w:ascii="Liberation Sans" w:eastAsia="Liberation Sans" w:hAnsi="Liberation Sans" w:cs="Liberation Sans"/>
-                      <w:b/>
-                      <w:bCs/>
-                    </w:rPr>
-                    <w:t xml:space="preserve">Fuente </w:t>
-                  </w:r>
-                  <w:r>
-                    <w:rPr>
-                      <w:rFonts w:ascii="Liberation Sans" w:eastAsia="Liberation Sans" w:hAnsi="Liberation Sans" w:cs="Liberation Sans"/>
-                      <w:b/>
-                      <w:bCs/>
-                    </w:rPr>
-                    <w:t>7</w:t>
-                  </w:r>
-                  <w:r>
-                    <w:rPr>
-                      <w:rFonts w:ascii="Liberation Sans" w:eastAsia="Liberation Sans" w:hAnsi="Liberation Sans" w:cs="Liberation Sans"/>
-                      <w:b/>
-                      <w:bCs/>
-                    </w:rPr>
-                    <w:t xml:space="preserve">: </w:t>
+                    <w:t xml:space="preserve">Fuente 7: </w:t>
                   </w:r>
                   <w:r>
                     <w:rPr>
@@ -1646,15 +1482,7 @@
                       <w:bCs/>
                     </w:rPr>
                     <w:br/>
-                    <w:t>-Enlace:</w:t>
-                  </w:r>
-                  <w:r>
-                    <w:rPr>
-                      <w:rFonts w:ascii="Liberation Sans" w:eastAsia="Liberation Sans" w:hAnsi="Liberation Sans" w:cs="Liberation Sans"/>
-                      <w:b/>
-                      <w:bCs/>
-                    </w:rPr>
-                    <w:t xml:space="preserve"> </w:t>
+                    <w:t xml:space="preserve">-Enlace: </w:t>
                   </w:r>
                   <w:hyperlink r:id="rId17" w:history="1">
                     <w:r>
@@ -1673,15 +1501,7 @@
                       <w:b/>
                       <w:bCs/>
                     </w:rPr>
-                    <w:t xml:space="preserve"> </w:t>
-                  </w:r>
-                  <w:r>
-                    <w:rPr>
-                      <w:rFonts w:ascii="Liberation Sans" w:eastAsia="Liberation Sans" w:hAnsi="Liberation Sans" w:cs="Liberation Sans"/>
-                      <w:b/>
-                      <w:bCs/>
-                    </w:rPr>
-                    <w:t>(datos tomados desde el 06/25 hasta el 03/26)</w:t>
+                    <w:t xml:space="preserve"> (datos tomados desde el 06/25 hasta el 03/26)</w:t>
                   </w:r>
                   <w:r>
                     <w:rPr>
@@ -1699,13 +1519,6 @@
                       <w:bCs/>
                     </w:rPr>
                     <w:br/>
-                  </w:r>
-                  <w:r>
-                    <w:rPr>
-                      <w:rFonts w:ascii="Liberation Sans" w:eastAsia="Liberation Sans" w:hAnsi="Liberation Sans" w:cs="Liberation Sans"/>
-                      <w:b/>
-                      <w:bCs/>
-                    </w:rPr>
                     <w:t xml:space="preserve">-Nombre: </w:t>
                   </w:r>
                   <w:r>
@@ -1778,30 +1591,7 @@
                       <w:bCs/>
                     </w:rPr>
                     <w:br/>
-                  </w:r>
-                  <w:r>
-                    <w:rPr>
-                      <w:rFonts w:ascii="Liberation Sans" w:eastAsia="Liberation Sans" w:hAnsi="Liberation Sans" w:cs="Liberation Sans"/>
-                      <w:b/>
-                      <w:bCs/>
-                    </w:rPr>
-                    <w:t xml:space="preserve">Fuente </w:t>
-                  </w:r>
-                  <w:r>
-                    <w:rPr>
-                      <w:rFonts w:ascii="Liberation Sans" w:eastAsia="Liberation Sans" w:hAnsi="Liberation Sans" w:cs="Liberation Sans"/>
-                      <w:b/>
-                      <w:bCs/>
-                    </w:rPr>
-                    <w:t>9</w:t>
-                  </w:r>
-                  <w:r>
-                    <w:rPr>
-                      <w:rFonts w:ascii="Liberation Sans" w:eastAsia="Liberation Sans" w:hAnsi="Liberation Sans" w:cs="Liberation Sans"/>
-                      <w:b/>
-                      <w:bCs/>
-                    </w:rPr>
-                    <w:t>:</w:t>
+                    <w:t>Fuente 9:</w:t>
                   </w:r>
                   <w:r>
                     <w:rPr>
@@ -1856,7 +1646,7 @@
                     </w:rPr>
                     <w:t xml:space="preserve"> </w:t>
                   </w:r>
-                  <w:hyperlink r:id="rId19" w:history="1">
+                  <w:hyperlink r:id="rId19" w:anchor="/ebc/encuesta-cultura-ciudadana-2025" w:history="1">
                     <w:r>
                       <w:rPr>
                         <w:rStyle w:val="Hipervnculo"/>
@@ -1919,18 +1709,8 @@
           <w:bCs/>
         </w:rPr>
         <w:lastRenderedPageBreak/>
-        <w:t xml:space="preserve">Variables </w:t>
+        <w:t>Variables clave identificadas</w:t>
       </w:r>
-      <w:proofErr w:type="gramStart"/>
-      <w:r>
-        <w:rPr>
-          <w:rFonts w:ascii="Liberation Sans" w:eastAsia="Liberation Sans" w:hAnsi="Liberation Sans" w:cs="Liberation Sans"/>
-          <w:b/>
-          <w:bCs/>
-        </w:rPr>
-        <w:t>clave identificadas</w:t>
-      </w:r>
-      <w:proofErr w:type="gramEnd"/>
       <w:r>
         <w:rPr>
           <w:rFonts w:ascii="Liberation Sans" w:eastAsia="Liberation Sans" w:hAnsi="Liberation Sans" w:cs="Liberation Sans"/>
@@ -2904,6 +2684,7 @@
           <w:rFonts w:ascii="Liberation Sans" w:eastAsia="Liberation Sans" w:hAnsi="Liberation Sans" w:cs="Liberation Sans"/>
           <w:b/>
           <w:bCs/>
+          <w:lang w:val="en-US"/>
         </w:rPr>
       </w:pPr>
       <w:r>
@@ -2911,6 +2692,7 @@
           <w:rFonts w:ascii="Liberation Sans" w:eastAsia="Liberation Sans" w:hAnsi="Liberation Sans" w:cs="Liberation Sans"/>
           <w:b/>
           <w:bCs/>
+          <w:lang w:val="en-US"/>
         </w:rPr>
         <w:t xml:space="preserve">Otro: </w:t>
       </w:r>
@@ -2925,20 +2707,25 @@
           <w:placeholder>
             <w:docPart w:val="8BB674EAA0624E12B56B3E5149BAB590"/>
           </w:placeholder>
-          <w:showingPlcHdr/>
         </w:sdtPr>
         <w:sdtContent>
           <w:r>
             <w:rPr>
-              <w:rStyle w:val="Textodelmarcadordeposicin"/>
-            </w:rPr>
-            <w:t>Introduzca el nombre de cada una de las herramientas que emplearán</w:t>
-          </w:r>
-          <w:r>
-            <w:rPr>
-              <w:rStyle w:val="Textodelmarcadordeposicin"/>
-            </w:rPr>
-            <w:t>.</w:t>
+              <w:rFonts w:ascii="Liberation Sans" w:eastAsia="Liberation Sans" w:hAnsi="Liberation Sans" w:cs="Liberation Sans"/>
+              <w:b/>
+              <w:bCs/>
+              <w:lang w:val="en-US"/>
+            </w:rPr>
+            <w:t>Deepseek, ChatGPT, Gemini, C</w:t>
+          </w:r>
+          <w:r>
+            <w:rPr>
+              <w:rFonts w:ascii="Liberation Sans" w:eastAsia="Liberation Sans" w:hAnsi="Liberation Sans" w:cs="Liberation Sans"/>
+              <w:b/>
+              <w:bCs/>
+              <w:lang w:val="en-US"/>
+            </w:rPr>
+            <w:t>laude</w:t>
           </w:r>
         </w:sdtContent>
       </w:sdt>
@@ -2950,6 +2737,7 @@
           <w:rFonts w:ascii="Liberation Sans" w:eastAsia="Liberation Sans" w:hAnsi="Liberation Sans" w:cs="Liberation Sans"/>
           <w:b/>
           <w:bCs/>
+          <w:lang w:val="en-US"/>
         </w:rPr>
       </w:pPr>
     </w:p>
@@ -7969,6 +7757,7 @@
   <w:style w:type="character" w:default="1" w:styleId="Fuentedeprrafopredeter">
     <w:name w:val="Default Paragraph Font"/>
     <w:uiPriority w:val="1"/>
+    <w:semiHidden/>
     <w:unhideWhenUsed/>
   </w:style>
   <w:style w:type="table" w:default="1" w:styleId="Tablanormal">
@@ -10107,8 +9896,11 @@
     <w:rsid w:val="005805C8"/>
     <w:rsid w:val="005A0D10"/>
     <w:rsid w:val="005F53B5"/>
+    <w:rsid w:val="00604B12"/>
+    <w:rsid w:val="00651B02"/>
     <w:rsid w:val="00677794"/>
     <w:rsid w:val="006A451D"/>
+    <w:rsid w:val="0081050B"/>
     <w:rsid w:val="00847187"/>
     <w:rsid w:val="008A3700"/>
     <w:rsid w:val="008B30CA"/>
@@ -12831,19 +12623,6 @@
 </file>
 
 <file path=customXml/item1.xml><?xml version="1.0" encoding="utf-8"?>
-<b:Sources xmlns:b="http://schemas.openxmlformats.org/officeDocument/2006/bibliography" xmlns="http://schemas.openxmlformats.org/officeDocument/2006/bibliography" SelectedStyle="\APASixthEditionOfficeOnline.xsl" StyleName="APA" Version="6"/>
-</file>
-
-<file path=customXml/item2.xml><?xml version="1.0" encoding="utf-8"?>
-<?mso-contentType ?>
-<FormTemplates xmlns="http://schemas.microsoft.com/sharepoint/v3/contenttype/forms">
-  <Display>DocumentLibraryForm</Display>
-  <Edit>DocumentLibraryForm</Edit>
-  <New>DocumentLibraryForm</New>
-</FormTemplates>
-</file>
-
-<file path=customXml/item3.xml><?xml version="1.0" encoding="utf-8"?>
 <ct:contentTypeSchema xmlns:ct="http://schemas.microsoft.com/office/2006/metadata/contentType" xmlns:ma="http://schemas.microsoft.com/office/2006/metadata/properties/metaAttributes" ct:_="" ma:_="" ma:contentTypeName="Documento" ma:contentTypeID="0x010100E35D5CFF27142147BAF1F3476208DFD8" ma:contentTypeVersion="21" ma:contentTypeDescription="Crear nuevo documento." ma:contentTypeScope="" ma:versionID="bf36b99a6e9cb6c4c04e69905c56a055">
   <xsd:schema xmlns:xsd="http://www.w3.org/2001/XMLSchema" xmlns:xs="http://www.w3.org/2001/XMLSchema" xmlns:p="http://schemas.microsoft.com/office/2006/metadata/properties" xmlns:ns1="http://schemas.microsoft.com/sharepoint/v3" xmlns:ns2="9c3aca8e-802d-4afe-8de2-403351c573ee" xmlns:ns3="7755e09e-18d1-493a-950e-5a615bcdbc52" targetNamespace="http://schemas.microsoft.com/office/2006/metadata/properties" ma:root="true" ma:fieldsID="0aadd8d177eb5bb2c3d9d64c2b0f37ab" ns1:_="" ns2:_="" ns3:_="">
     <xsd:import namespace="http://schemas.microsoft.com/sharepoint/v3"/>
@@ -13121,6 +12900,19 @@
 </ct:contentTypeSchema>
 </file>
 
+<file path=customXml/item2.xml><?xml version="1.0" encoding="utf-8"?>
+<?mso-contentType ?>
+<FormTemplates xmlns="http://schemas.microsoft.com/sharepoint/v3/contenttype/forms">
+  <Display>DocumentLibraryForm</Display>
+  <Edit>DocumentLibraryForm</Edit>
+  <New>DocumentLibraryForm</New>
+</FormTemplates>
+</file>
+
+<file path=customXml/item3.xml><?xml version="1.0" encoding="utf-8"?>
+<b:Sources xmlns:b="http://schemas.openxmlformats.org/officeDocument/2006/bibliography" xmlns="http://schemas.openxmlformats.org/officeDocument/2006/bibliography" SelectedStyle="\APASixthEditionOfficeOnline.xsl" StyleName="APA" Version="6"/>
+</file>
+
 <file path=customXml/item4.xml><?xml version="1.0" encoding="utf-8"?>
 <p:properties xmlns:p="http://schemas.microsoft.com/office/2006/metadata/properties" xmlns:xsi="http://www.w3.org/2001/XMLSchema-instance" xmlns:pc="http://schemas.microsoft.com/office/infopath/2007/PartnerControls">
   <documentManagement>
@@ -13135,22 +12927,6 @@
 </file>
 
 <file path=customXml/itemProps1.xml><?xml version="1.0" encoding="utf-8"?>
-<ds:datastoreItem xmlns:ds="http://schemas.openxmlformats.org/officeDocument/2006/customXml" ds:itemID="{1C7E8C72-8D6F-40D6-BD69-93E029065D11}">
-  <ds:schemaRefs>
-    <ds:schemaRef ds:uri="http://schemas.openxmlformats.org/officeDocument/2006/bibliography"/>
-  </ds:schemaRefs>
-</ds:datastoreItem>
-</file>
-
-<file path=customXml/itemProps2.xml><?xml version="1.0" encoding="utf-8"?>
-<ds:datastoreItem xmlns:ds="http://schemas.openxmlformats.org/officeDocument/2006/customXml" ds:itemID="{9B6DFC92-80A5-46F4-B508-CDB322A80F3D}">
-  <ds:schemaRefs>
-    <ds:schemaRef ds:uri="http://schemas.microsoft.com/sharepoint/v3/contenttype/forms"/>
-  </ds:schemaRefs>
-</ds:datastoreItem>
-</file>
-
-<file path=customXml/itemProps3.xml><?xml version="1.0" encoding="utf-8"?>
 <ds:datastoreItem xmlns:ds="http://schemas.openxmlformats.org/officeDocument/2006/customXml" ds:itemID="{4B8B55E9-5053-40E5-969F-1FA1C27EFDA0}">
   <ds:schemaRefs>
     <ds:schemaRef ds:uri="http://schemas.microsoft.com/office/2006/metadata/contentType"/>
@@ -13166,6 +12942,22 @@
     <ds:schemaRef ds:uri="http://purl.org/dc/elements/1.1/"/>
     <ds:schemaRef ds:uri="http://purl.org/dc/terms/"/>
     <ds:schemaRef ds:uri="http://schemas.microsoft.com/internal/obd"/>
+  </ds:schemaRefs>
+</ds:datastoreItem>
+</file>
+
+<file path=customXml/itemProps2.xml><?xml version="1.0" encoding="utf-8"?>
+<ds:datastoreItem xmlns:ds="http://schemas.openxmlformats.org/officeDocument/2006/customXml" ds:itemID="{9B6DFC92-80A5-46F4-B508-CDB322A80F3D}">
+  <ds:schemaRefs>
+    <ds:schemaRef ds:uri="http://schemas.microsoft.com/sharepoint/v3/contenttype/forms"/>
+  </ds:schemaRefs>
+</ds:datastoreItem>
+</file>
+
+<file path=customXml/itemProps3.xml><?xml version="1.0" encoding="utf-8"?>
+<ds:datastoreItem xmlns:ds="http://schemas.openxmlformats.org/officeDocument/2006/customXml" ds:itemID="{1C7E8C72-8D6F-40D6-BD69-93E029065D11}">
+  <ds:schemaRefs>
+    <ds:schemaRef ds:uri="http://schemas.openxmlformats.org/officeDocument/2006/bibliography"/>
   </ds:schemaRefs>
 </ds:datastoreItem>
 </file>

</xml_diff>

<commit_message>
todas las variables de la encuesta de percepción, favor revisar.
</commit_message>
<xml_diff>
--- a/docs/5-1. FORMULARIO_CARACTERIZACIÓN_FORMULACIÓN_PROBLEMAS-2.docx
+++ b/docs/5-1. FORMULARIO_CARACTERIZACIÓN_FORMULACIÓN_PROBLEMAS-2.docx
@@ -3628,6 +3628,57 @@
             </w:rPr>
             <w:br/>
           </w:r>
+          <w:r>
+            <w:rPr>
+              <w:rFonts w:ascii="Liberation Sans" w:eastAsia="Liberation Sans" w:hAnsi="Liberation Sans" w:cs="Liberation Sans"/>
+              <w:b/>
+              <w:bCs/>
+            </w:rPr>
+            <w:tab/>
+          </w:r>
+          <w:proofErr w:type="spellStart"/>
+          <w:r>
+            <w:rPr>
+              <w:rFonts w:ascii="Liberation Sans" w:eastAsia="Liberation Sans" w:hAnsi="Liberation Sans" w:cs="Liberation Sans"/>
+              <w:b/>
+              <w:bCs/>
+            </w:rPr>
+            <w:t>Cod_Locali</w:t>
+          </w:r>
+          <w:proofErr w:type="spellEnd"/>
+          <w:r>
+            <w:rPr>
+              <w:rFonts w:ascii="Liberation Sans" w:eastAsia="Liberation Sans" w:hAnsi="Liberation Sans" w:cs="Liberation Sans"/>
+              <w:b/>
+              <w:bCs/>
+            </w:rPr>
+            <w:t xml:space="preserve"> (código de localidad): Se usa como llave territorial.</w:t>
+          </w:r>
+          <w:r>
+            <w:rPr>
+              <w:rFonts w:ascii="Liberation Sans" w:eastAsia="Liberation Sans" w:hAnsi="Liberation Sans" w:cs="Liberation Sans"/>
+              <w:b/>
+              <w:bCs/>
+            </w:rPr>
+            <w:br/>
+          </w:r>
+          <w:r>
+            <w:rPr>
+              <w:rFonts w:ascii="Liberation Sans" w:eastAsia="Liberation Sans" w:hAnsi="Liberation Sans" w:cs="Liberation Sans"/>
+              <w:b/>
+              <w:bCs/>
+            </w:rPr>
+            <w:tab/>
+            <w:t>Fecha: Se usa como llave temporal.</w:t>
+          </w:r>
+          <w:r>
+            <w:rPr>
+              <w:rFonts w:ascii="Liberation Sans" w:eastAsia="Liberation Sans" w:hAnsi="Liberation Sans" w:cs="Liberation Sans"/>
+              <w:b/>
+              <w:bCs/>
+            </w:rPr>
+            <w:br/>
+          </w:r>
         </w:sdtContent>
       </w:sdt>
     </w:p>
@@ -4523,6 +4574,7 @@
           <w:b/>
           <w:bCs/>
         </w:rPr>
+        <w:lastRenderedPageBreak/>
         <w:t xml:space="preserve">Looker Studio </w:t>
       </w:r>
       <w:sdt>
@@ -5498,6 +5550,7 @@
           <w:sz w:val="20"/>
           <w:szCs w:val="20"/>
         </w:rPr>
+        <w:lastRenderedPageBreak/>
         <w:t xml:space="preserve">Sección </w:t>
       </w:r>
       <w:r>
@@ -11855,6 +11908,7 @@
     <w:rsid w:val="00017FC6"/>
     <w:rsid w:val="000D0051"/>
     <w:rsid w:val="00192B9E"/>
+    <w:rsid w:val="003C10E2"/>
     <w:rsid w:val="005805C8"/>
     <w:rsid w:val="005A0D10"/>
     <w:rsid w:val="005F53B5"/>
@@ -11878,7 +11932,6 @@
     <w:rsid w:val="00C05A05"/>
     <w:rsid w:val="00C40C34"/>
     <w:rsid w:val="00DA555B"/>
-    <w:rsid w:val="00DB57ED"/>
     <w:rsid w:val="00EE3589"/>
     <w:rsid w:val="00F05331"/>
     <w:rsid w:val="00F80900"/>

</xml_diff>